<commit_message>
Add updated template with image tags
</commit_message>
<xml_diff>
--- a/src/templates/template.docx
+++ b/src/templates/template.docx
@@ -161,8 +161,44 @@
             <w:vAlign w:val="center"/>
           </w:tcPr>
           <w:p>
-            <w:r>
-              <w:t>{siteName}</w:t>
+            <w:pPr>
+              <w:overflowPunct/>
+              <w:autoSpaceDE/>
+              <w:autoSpaceDN/>
+              <w:adjustRightInd/>
+              <w:jc w:val="center"/>
+              <w:textAlignment w:val="auto"/>
+              <w:rPr>
+                <w:rFonts w:asciiTheme="minorHAnsi" w:hAnsiTheme="minorHAnsi" w:cs="Arial"/>
+                <w:b/>
+                <w:bCs/>
+              </w:rPr>
+            </w:pPr>
+            <w:r>
+              <w:rPr>
+                <w:rFonts w:asciiTheme="minorHAnsi" w:hAnsiTheme="minorHAnsi" w:cs="Arial"/>
+                <w:b/>
+                <w:bCs/>
+              </w:rPr>
+              <w:t>{</w:t>
+            </w:r>
+            <w:proofErr w:type="spellStart"/>
+            <w:r>
+              <w:rPr>
+                <w:rFonts w:asciiTheme="minorHAnsi" w:hAnsiTheme="minorHAnsi" w:cs="Arial"/>
+                <w:b/>
+                <w:bCs/>
+              </w:rPr>
+              <w:t>siteName</w:t>
+            </w:r>
+            <w:proofErr w:type="spellEnd"/>
+            <w:r>
+              <w:rPr>
+                <w:rFonts w:asciiTheme="minorHAnsi" w:hAnsiTheme="minorHAnsi" w:cs="Arial"/>
+                <w:b/>
+                <w:bCs/>
+              </w:rPr>
+              <w:t>}</w:t>
             </w:r>
           </w:p>
         </w:tc>
@@ -210,9 +246,64 @@
             <w:vAlign w:val="center"/>
           </w:tcPr>
           <w:p>
-            <w:r>
-              <w:t>{systemSize}</w:t>
-            </w:r>
+            <w:pPr>
+              <w:overflowPunct/>
+              <w:autoSpaceDE/>
+              <w:autoSpaceDN/>
+              <w:adjustRightInd/>
+              <w:ind w:left="720"/>
+              <w:textAlignment w:val="auto"/>
+              <w:rPr>
+                <w:rFonts w:asciiTheme="minorHAnsi" w:hAnsiTheme="minorHAnsi" w:cs="Arial"/>
+                <w:b/>
+                <w:bCs/>
+                <w:lang w:val="en-MY"/>
+              </w:rPr>
+            </w:pPr>
+            <w:r>
+              <w:rPr>
+                <w:rFonts w:asciiTheme="minorHAnsi" w:hAnsiTheme="minorHAnsi" w:cs="Arial"/>
+                <w:b/>
+                <w:bCs/>
+                <w:lang w:val="en-MY"/>
+              </w:rPr>
+              <w:t>{</w:t>
+            </w:r>
+            <w:proofErr w:type="spellStart"/>
+            <w:r>
+              <w:rPr>
+                <w:rFonts w:asciiTheme="minorHAnsi" w:hAnsiTheme="minorHAnsi" w:cs="Arial"/>
+                <w:b/>
+                <w:bCs/>
+                <w:lang w:val="en-MY"/>
+              </w:rPr>
+              <w:t>systemSize</w:t>
+            </w:r>
+            <w:proofErr w:type="spellEnd"/>
+            <w:r>
+              <w:rPr>
+                <w:rFonts w:asciiTheme="minorHAnsi" w:hAnsiTheme="minorHAnsi" w:cs="Arial"/>
+                <w:b/>
+                <w:bCs/>
+                <w:lang w:val="en-MY"/>
+              </w:rPr>
+              <w:t>}</w:t>
+            </w:r>
+          </w:p>
+          <w:p>
+            <w:pPr>
+              <w:overflowPunct/>
+              <w:autoSpaceDE/>
+              <w:autoSpaceDN/>
+              <w:adjustRightInd/>
+              <w:jc w:val="center"/>
+              <w:textAlignment w:val="auto"/>
+              <w:rPr>
+                <w:rFonts w:asciiTheme="minorHAnsi" w:hAnsiTheme="minorHAnsi" w:cs="Arial"/>
+                <w:b/>
+                <w:bCs/>
+              </w:rPr>
+            </w:pPr>
           </w:p>
         </w:tc>
       </w:tr>
@@ -276,9 +367,64 @@
             <w:vAlign w:val="center"/>
           </w:tcPr>
           <w:p>
-            <w:r>
-              <w:t>{startDate}</w:t>
-            </w:r>
+            <w:pPr>
+              <w:overflowPunct/>
+              <w:autoSpaceDE/>
+              <w:autoSpaceDN/>
+              <w:adjustRightInd/>
+              <w:ind w:left="720"/>
+              <w:textAlignment w:val="auto"/>
+              <w:rPr>
+                <w:rFonts w:asciiTheme="minorHAnsi" w:hAnsiTheme="minorHAnsi" w:cs="Arial"/>
+                <w:b/>
+                <w:bCs/>
+                <w:lang w:val="en-MY"/>
+              </w:rPr>
+            </w:pPr>
+            <w:r>
+              <w:rPr>
+                <w:rFonts w:asciiTheme="minorHAnsi" w:hAnsiTheme="minorHAnsi" w:cs="Arial"/>
+                <w:b/>
+                <w:bCs/>
+                <w:lang w:val="en-MY"/>
+              </w:rPr>
+              <w:t>{</w:t>
+            </w:r>
+            <w:proofErr w:type="spellStart"/>
+            <w:r>
+              <w:rPr>
+                <w:rFonts w:asciiTheme="minorHAnsi" w:hAnsiTheme="minorHAnsi" w:cs="Arial"/>
+                <w:b/>
+                <w:bCs/>
+                <w:lang w:val="en-MY"/>
+              </w:rPr>
+              <w:t>startDate</w:t>
+            </w:r>
+            <w:proofErr w:type="spellEnd"/>
+            <w:r>
+              <w:rPr>
+                <w:rFonts w:asciiTheme="minorHAnsi" w:hAnsiTheme="minorHAnsi" w:cs="Arial"/>
+                <w:b/>
+                <w:bCs/>
+                <w:lang w:val="en-MY"/>
+              </w:rPr>
+              <w:t>}</w:t>
+            </w:r>
+          </w:p>
+          <w:p>
+            <w:pPr>
+              <w:overflowPunct/>
+              <w:autoSpaceDE/>
+              <w:autoSpaceDN/>
+              <w:adjustRightInd/>
+              <w:jc w:val="center"/>
+              <w:textAlignment w:val="auto"/>
+              <w:rPr>
+                <w:rFonts w:asciiTheme="minorHAnsi" w:hAnsiTheme="minorHAnsi" w:cs="Arial"/>
+                <w:b/>
+                <w:bCs/>
+              </w:rPr>
+            </w:pPr>
           </w:p>
         </w:tc>
         <w:tc>
@@ -317,9 +463,64 @@
             <w:vAlign w:val="center"/>
           </w:tcPr>
           <w:p>
-            <w:r>
-              <w:t>{endDate}</w:t>
-            </w:r>
+            <w:pPr>
+              <w:overflowPunct/>
+              <w:autoSpaceDE/>
+              <w:autoSpaceDN/>
+              <w:adjustRightInd/>
+              <w:ind w:left="720"/>
+              <w:textAlignment w:val="auto"/>
+              <w:rPr>
+                <w:rFonts w:asciiTheme="minorHAnsi" w:hAnsiTheme="minorHAnsi" w:cs="Arial"/>
+                <w:b/>
+                <w:bCs/>
+                <w:lang w:val="en-MY"/>
+              </w:rPr>
+            </w:pPr>
+            <w:r>
+              <w:rPr>
+                <w:rFonts w:asciiTheme="minorHAnsi" w:hAnsiTheme="minorHAnsi" w:cs="Arial"/>
+                <w:b/>
+                <w:bCs/>
+                <w:lang w:val="en-MY"/>
+              </w:rPr>
+              <w:t>{</w:t>
+            </w:r>
+            <w:proofErr w:type="spellStart"/>
+            <w:r>
+              <w:rPr>
+                <w:rFonts w:asciiTheme="minorHAnsi" w:hAnsiTheme="minorHAnsi" w:cs="Arial"/>
+                <w:b/>
+                <w:bCs/>
+                <w:lang w:val="en-MY"/>
+              </w:rPr>
+              <w:t>endDate</w:t>
+            </w:r>
+            <w:proofErr w:type="spellEnd"/>
+            <w:r>
+              <w:rPr>
+                <w:rFonts w:asciiTheme="minorHAnsi" w:hAnsiTheme="minorHAnsi" w:cs="Arial"/>
+                <w:b/>
+                <w:bCs/>
+                <w:lang w:val="en-MY"/>
+              </w:rPr>
+              <w:t>}</w:t>
+            </w:r>
+          </w:p>
+          <w:p>
+            <w:pPr>
+              <w:overflowPunct/>
+              <w:autoSpaceDE/>
+              <w:autoSpaceDN/>
+              <w:adjustRightInd/>
+              <w:jc w:val="center"/>
+              <w:textAlignment w:val="auto"/>
+              <w:rPr>
+                <w:rFonts w:asciiTheme="minorHAnsi" w:hAnsiTheme="minorHAnsi" w:cs="Arial"/>
+                <w:b/>
+                <w:bCs/>
+              </w:rPr>
+            </w:pPr>
           </w:p>
         </w:tc>
       </w:tr>
@@ -451,8 +652,48 @@
             <w:vAlign w:val="center"/>
           </w:tcPr>
           <w:p>
-            <w:r>
-              <w:t>{picName}</w:t>
+            <w:pPr>
+              <w:overflowPunct/>
+              <w:autoSpaceDE/>
+              <w:autoSpaceDN/>
+              <w:adjustRightInd/>
+              <w:ind w:left="720"/>
+              <w:textAlignment w:val="auto"/>
+              <w:rPr>
+                <w:rFonts w:ascii="Calibri" w:hAnsi="Calibri" w:cs="Calibri"/>
+                <w:b/>
+                <w:bCs/>
+                <w:lang w:val="en-MY"/>
+              </w:rPr>
+            </w:pPr>
+            <w:r>
+              <w:rPr>
+                <w:rFonts w:ascii="Calibri" w:hAnsi="Calibri" w:cs="Calibri"/>
+                <w:b/>
+                <w:bCs/>
+                <w:lang w:val="en-MY"/>
+              </w:rPr>
+              <w:t>{</w:t>
+            </w:r>
+            <w:proofErr w:type="spellStart"/>
+            <w:r>
+              <w:rPr>
+                <w:rFonts w:ascii="Calibri" w:hAnsi="Calibri" w:cs="Calibri"/>
+                <w:b/>
+                <w:bCs/>
+                <w:lang w:val="en-MY"/>
+              </w:rPr>
+              <w:t>picName</w:t>
+            </w:r>
+            <w:proofErr w:type="spellEnd"/>
+            <w:r>
+              <w:rPr>
+                <w:rFonts w:ascii="Calibri" w:hAnsi="Calibri" w:cs="Calibri"/>
+                <w:b/>
+                <w:bCs/>
+                <w:lang w:val="en-MY"/>
+              </w:rPr>
+              <w:t>}</w:t>
             </w:r>
           </w:p>
         </w:tc>
@@ -519,9 +760,31 @@
             <w:vAlign w:val="center"/>
           </w:tcPr>
           <w:p>
-            <w:r>
+            <w:pPr>
+              <w:pStyle w:val="TableParagraph"/>
+              <w:spacing w:line="229" w:lineRule="exact"/>
+              <w:ind w:left="720"/>
+              <w:rPr>
+                <w:lang w:val="en-MY"/>
+              </w:rPr>
+            </w:pPr>
+            <w:r>
+              <w:rPr>
+                <w:lang w:val="en-MY"/>
+              </w:rPr>
               <w:t>{address}</w:t>
             </w:r>
+          </w:p>
+          <w:p>
+            <w:pPr>
+              <w:pStyle w:val="TableParagraph"/>
+              <w:spacing w:line="229" w:lineRule="exact"/>
+              <w:ind w:left="107"/>
+              <w:rPr>
+                <w:sz w:val="20"/>
+                <w:lang w:val="en-MY"/>
+              </w:rPr>
+            </w:pPr>
           </w:p>
         </w:tc>
       </w:tr>
@@ -816,11 +1079,68 @@
             <w:hideMark/>
           </w:tcPr>
           <w:p>
-            <w:r>
+            <w:pPr>
+              <w:overflowPunct/>
+              <w:autoSpaceDE/>
+              <w:autoSpaceDN/>
+              <w:adjustRightInd/>
+              <w:textAlignment w:val="auto"/>
+              <w:rPr>
+                <w:rFonts w:ascii="Arial" w:hAnsi="Arial" w:cs="Arial"/>
+                <w:lang w:val="en-MY"/>
+              </w:rPr>
+            </w:pPr>
+            <w:r>
+              <w:rPr>
+                <w:rFonts w:ascii="Arial" w:hAnsi="Arial" w:cs="Arial"/>
+                <w:lang w:val="en-MY"/>
+              </w:rPr>
               <w:t>Trina Solar TSM NEG19.20 620W</w:t>
-              <w:br/>
-              <w:br/>
-              <w:t>Serials: {serialNumbers}</w:t>
+            </w:r>
+          </w:p>
+          <w:p>
+            <w:pPr>
+              <w:pStyle w:val="ListParagraph"/>
+              <w:numPr>
+                <w:ilvl w:val="0"/>
+                <w:numId w:val="24"/>
+              </w:numPr>
+              <w:overflowPunct/>
+              <w:autoSpaceDE/>
+              <w:autoSpaceDN/>
+              <w:adjustRightInd/>
+              <w:textAlignment w:val="auto"/>
+              <w:rPr>
+                <w:rFonts w:ascii="Arial" w:hAnsi="Arial" w:cs="Arial"/>
+                <w:sz w:val="18"/>
+                <w:szCs w:val="18"/>
+              </w:rPr>
+            </w:pPr>
+            <w:r>
+              <w:rPr>
+                <w:rFonts w:ascii="Arial" w:hAnsi="Arial" w:cs="Arial"/>
+                <w:sz w:val="18"/>
+                <w:szCs w:val="18"/>
+              </w:rPr>
+              <w:t>{</w:t>
+            </w:r>
+            <w:proofErr w:type="spellStart"/>
+            <w:r>
+              <w:rPr>
+                <w:rFonts w:ascii="Arial" w:hAnsi="Arial" w:cs="Arial"/>
+                <w:sz w:val="18"/>
+                <w:szCs w:val="18"/>
+              </w:rPr>
+              <w:t>serialNumbers</w:t>
+            </w:r>
+            <w:proofErr w:type="spellEnd"/>
+            <w:r>
+              <w:rPr>
+                <w:rFonts w:ascii="Arial" w:hAnsi="Arial" w:cs="Arial"/>
+                <w:sz w:val="18"/>
+                <w:szCs w:val="18"/>
+              </w:rPr>
+              <w:t>}</w:t>
             </w:r>
           </w:p>
         </w:tc>
@@ -839,6 +1159,7 @@
               <w:rPr>
                 <w:rFonts w:ascii="Arial" w:hAnsi="Arial" w:cs="Arial"/>
                 <w:color w:val="000000" w:themeColor="text1"/>
+                <w:lang w:val="en-MY"/>
               </w:rPr>
             </w:pPr>
             <w:r>
@@ -848,6 +1169,45 @@
               </w:rPr>
               <w:t xml:space="preserve"> </w:t>
             </w:r>
+            <w:r>
+              <w:rPr>
+                <w:rFonts w:ascii="Arial" w:hAnsi="Arial" w:cs="Arial"/>
+                <w:color w:val="000000" w:themeColor="text1"/>
+                <w:lang w:val="en-MY"/>
+              </w:rPr>
+              <w:t>{</w:t>
+            </w:r>
+            <w:proofErr w:type="spellStart"/>
+            <w:r>
+              <w:rPr>
+                <w:rFonts w:ascii="Arial" w:hAnsi="Arial" w:cs="Arial"/>
+                <w:color w:val="000000" w:themeColor="text1"/>
+                <w:lang w:val="en-MY"/>
+              </w:rPr>
+              <w:t>panelQty</w:t>
+            </w:r>
+            <w:proofErr w:type="spellEnd"/>
+            <w:r>
+              <w:rPr>
+                <w:rFonts w:ascii="Arial" w:hAnsi="Arial" w:cs="Arial"/>
+                <w:color w:val="000000" w:themeColor="text1"/>
+                <w:lang w:val="en-MY"/>
+              </w:rPr>
+              <w:t>}</w:t>
+            </w:r>
+          </w:p>
+          <w:p>
+            <w:pPr>
+              <w:overflowPunct/>
+              <w:autoSpaceDE/>
+              <w:autoSpaceDN/>
+              <w:adjustRightInd/>
+              <w:textAlignment w:val="auto"/>
+              <w:rPr>
+                <w:rFonts w:ascii="Arial" w:hAnsi="Arial" w:cs="Arial"/>
+                <w:color w:val="000000" w:themeColor="text1"/>
+              </w:rPr>
+            </w:pPr>
             <w:r>
               <w:rPr>
                 <w:rFonts w:ascii="Arial" w:hAnsi="Arial" w:cs="Arial"/>
@@ -954,6 +1314,50 @@
               <w:autoSpaceDE/>
               <w:autoSpaceDN/>
               <w:adjustRightInd/>
+              <w:ind w:left="720"/>
+              <w:textAlignment w:val="auto"/>
+              <w:rPr>
+                <w:rFonts w:ascii="Arial" w:hAnsi="Arial" w:cs="Arial"/>
+                <w:lang w:val="en-MY"/>
+              </w:rPr>
+            </w:pPr>
+            <w:r>
+              <w:rPr>
+                <w:rFonts w:ascii="Arial" w:hAnsi="Arial" w:cs="Arial"/>
+                <w:lang w:val="fi-FI"/>
+              </w:rPr>
+              <w:t>1. </w:t>
+            </w:r>
+            <w:r>
+              <w:rPr>
+                <w:rFonts w:ascii="Arial" w:hAnsi="Arial" w:cs="Arial"/>
+                <w:lang w:val="en-MY"/>
+              </w:rPr>
+              <w:t>{</w:t>
+            </w:r>
+            <w:proofErr w:type="spellStart"/>
+            <w:r>
+              <w:rPr>
+                <w:rFonts w:ascii="Arial" w:hAnsi="Arial" w:cs="Arial"/>
+                <w:lang w:val="en-MY"/>
+              </w:rPr>
+              <w:t>inverterSn</w:t>
+            </w:r>
+            <w:proofErr w:type="spellEnd"/>
+            <w:r>
+              <w:rPr>
+                <w:rFonts w:ascii="Arial" w:hAnsi="Arial" w:cs="Arial"/>
+                <w:lang w:val="en-MY"/>
+              </w:rPr>
+              <w:t>}</w:t>
+            </w:r>
+          </w:p>
+          <w:p>
+            <w:pPr>
+              <w:overflowPunct/>
+              <w:autoSpaceDE/>
+              <w:autoSpaceDN/>
+              <w:adjustRightInd/>
               <w:textAlignment w:val="auto"/>
               <w:rPr>
                 <w:rFonts w:asciiTheme="minorHAnsi" w:hAnsiTheme="minorHAnsi"/>
@@ -961,13 +1365,6 @@
                 <w:lang w:val="fi-FI"/>
               </w:rPr>
             </w:pPr>
-            <w:r>
-              <w:rPr>
-                <w:rFonts w:ascii="Arial" w:hAnsi="Arial" w:cs="Arial"/>
-                <w:lang w:val="fi-FI"/>
-              </w:rPr>
-              <w:t>1. </w:t>
-            </w:r>
           </w:p>
         </w:tc>
         <w:tc>
@@ -2147,6 +2544,40 @@
     </w:p>
     <w:p>
       <w:pPr>
+        <w:pStyle w:val="ListParagraph"/>
+        <w:overflowPunct/>
+        <w:autoSpaceDE/>
+        <w:autoSpaceDN/>
+        <w:adjustRightInd/>
+        <w:contextualSpacing w:val="0"/>
+        <w:textAlignment w:val="auto"/>
+        <w:rPr>
+          <w:rFonts w:asciiTheme="minorHAnsi" w:hAnsiTheme="minorHAnsi" w:cs="Arial"/>
+        </w:rPr>
+      </w:pPr>
+      <w:r>
+        <w:rPr>
+          <w:rFonts w:asciiTheme="minorHAnsi" w:hAnsiTheme="minorHAnsi" w:cs="Arial"/>
+        </w:rPr>
+        <w:t>{%</w:t>
+      </w:r>
+      <w:proofErr w:type="spellStart"/>
+      <w:r>
+        <w:rPr>
+          <w:rFonts w:asciiTheme="minorHAnsi" w:hAnsiTheme="minorHAnsi" w:cs="Arial"/>
+        </w:rPr>
+        <w:t>img_sld</w:t>
+      </w:r>
+      <w:proofErr w:type="spellEnd"/>
+      <w:r>
+        <w:rPr>
+          <w:rFonts w:asciiTheme="minorHAnsi" w:hAnsiTheme="minorHAnsi" w:cs="Arial"/>
+        </w:rPr>
+        <w:t>}</w:t>
+      </w:r>
+    </w:p>
+    <w:p>
+      <w:pPr>
         <w:overflowPunct/>
         <w:autoSpaceDE/>
         <w:autoSpaceDN/>
@@ -2213,6 +2644,40 @@
     </w:p>
     <w:p>
       <w:pPr>
+        <w:pStyle w:val="ListParagraph"/>
+        <w:overflowPunct/>
+        <w:autoSpaceDE/>
+        <w:autoSpaceDN/>
+        <w:adjustRightInd/>
+        <w:contextualSpacing w:val="0"/>
+        <w:textAlignment w:val="auto"/>
+        <w:rPr>
+          <w:rFonts w:asciiTheme="minorHAnsi" w:hAnsiTheme="minorHAnsi" w:cs="Arial"/>
+        </w:rPr>
+      </w:pPr>
+      <w:r>
+        <w:rPr>
+          <w:rFonts w:asciiTheme="minorHAnsi" w:hAnsiTheme="minorHAnsi" w:cs="Arial"/>
+        </w:rPr>
+        <w:t>{%</w:t>
+      </w:r>
+      <w:proofErr w:type="spellStart"/>
+      <w:r>
+        <w:rPr>
+          <w:rFonts w:asciiTheme="minorHAnsi" w:hAnsiTheme="minorHAnsi" w:cs="Arial"/>
+        </w:rPr>
+        <w:t>img_pvlayout</w:t>
+      </w:r>
+      <w:proofErr w:type="spellEnd"/>
+      <w:r>
+        <w:rPr>
+          <w:rFonts w:asciiTheme="minorHAnsi" w:hAnsiTheme="minorHAnsi" w:cs="Arial"/>
+        </w:rPr>
+        <w:t>}</w:t>
+      </w:r>
+    </w:p>
+    <w:p>
+      <w:pPr>
         <w:overflowPunct/>
         <w:autoSpaceDE/>
         <w:autoSpaceDN/>
@@ -2880,7 +3345,6 @@
           <w:b/>
           <w:bCs/>
         </w:rPr>
-        <w:lastRenderedPageBreak/>
         <w:t>4</w:t>
       </w:r>
       <w:r>
@@ -3150,6 +3614,26 @@
                 <w:lang w:val="en-MY"/>
               </w:rPr>
             </w:pPr>
+            <w:r>
+              <w:rPr>
+                <w:rFonts w:asciiTheme="minorHAnsi" w:hAnsiTheme="minorHAnsi"/>
+              </w:rPr>
+              <w:t>{%</w:t>
+            </w:r>
+            <w:proofErr w:type="spellStart"/>
+            <w:r>
+              <w:rPr>
+                <w:rFonts w:asciiTheme="minorHAnsi" w:hAnsiTheme="minorHAnsi"/>
+              </w:rPr>
+              <w:t>img_array</w:t>
+            </w:r>
+            <w:proofErr w:type="spellEnd"/>
+            <w:r>
+              <w:rPr>
+                <w:rFonts w:asciiTheme="minorHAnsi" w:hAnsiTheme="minorHAnsi"/>
+              </w:rPr>
+              <w:t>}</w:t>
+            </w:r>
           </w:p>
         </w:tc>
       </w:tr>
@@ -3422,7 +3906,6 @@
                 <w:sz w:val="20"/>
                 <w:lang w:val="en-MY"/>
               </w:rPr>
-              <w:lastRenderedPageBreak/>
               <w:t>AC and DC Cable Route</w:t>
             </w:r>
           </w:p>
@@ -3485,6 +3968,26 @@
                 <w:rFonts w:ascii="Maxis" w:hAnsi="Maxis"/>
               </w:rPr>
             </w:pPr>
+            <w:r>
+              <w:rPr>
+                <w:rFonts w:ascii="Maxis" w:hAnsi="Maxis"/>
+              </w:rPr>
+              <w:t>{%</w:t>
+            </w:r>
+            <w:proofErr w:type="spellStart"/>
+            <w:r>
+              <w:rPr>
+                <w:rFonts w:ascii="Maxis" w:hAnsi="Maxis"/>
+              </w:rPr>
+              <w:t>img_route</w:t>
+            </w:r>
+            <w:proofErr w:type="spellEnd"/>
+            <w:r>
+              <w:rPr>
+                <w:rFonts w:ascii="Maxis" w:hAnsi="Maxis"/>
+              </w:rPr>
+              <w:t>}</w:t>
+            </w:r>
           </w:p>
           <w:p>
             <w:pPr>
@@ -3740,6 +4243,26 @@
               </w:rPr>
               <w:t xml:space="preserve">  </w:t>
             </w:r>
+            <w:r>
+              <w:rPr>
+                <w:rFonts w:asciiTheme="minorHAnsi" w:hAnsiTheme="minorHAnsi"/>
+              </w:rPr>
+              <w:t>{%</w:t>
+            </w:r>
+            <w:proofErr w:type="spellStart"/>
+            <w:r>
+              <w:rPr>
+                <w:rFonts w:asciiTheme="minorHAnsi" w:hAnsiTheme="minorHAnsi"/>
+              </w:rPr>
+              <w:t>img_inverter</w:t>
+            </w:r>
+            <w:proofErr w:type="spellEnd"/>
+            <w:r>
+              <w:rPr>
+                <w:rFonts w:asciiTheme="minorHAnsi" w:hAnsiTheme="minorHAnsi"/>
+              </w:rPr>
+              <w:t>}</w:t>
+            </w:r>
           </w:p>
           <w:p>
             <w:pPr>
@@ -3862,6 +4385,26 @@
               </w:rPr>
               <w:t xml:space="preserve"> </w:t>
             </w:r>
+            <w:r>
+              <w:rPr>
+                <w:rFonts w:asciiTheme="minorHAnsi" w:hAnsiTheme="minorHAnsi"/>
+              </w:rPr>
+              <w:t>{%</w:t>
+            </w:r>
+            <w:proofErr w:type="spellStart"/>
+            <w:r>
+              <w:rPr>
+                <w:rFonts w:asciiTheme="minorHAnsi" w:hAnsiTheme="minorHAnsi"/>
+              </w:rPr>
+              <w:t>img_combiner</w:t>
+            </w:r>
+            <w:proofErr w:type="spellEnd"/>
+            <w:r>
+              <w:rPr>
+                <w:rFonts w:asciiTheme="minorHAnsi" w:hAnsiTheme="minorHAnsi"/>
+              </w:rPr>
+              <w:t>}</w:t>
+            </w:r>
           </w:p>
           <w:p>
             <w:pPr>
@@ -4011,6 +4554,26 @@
               </w:rPr>
               <w:t xml:space="preserve"> </w:t>
             </w:r>
+            <w:r>
+              <w:rPr>
+                <w:rFonts w:asciiTheme="minorHAnsi" w:hAnsiTheme="minorHAnsi"/>
+              </w:rPr>
+              <w:t>{%</w:t>
+            </w:r>
+            <w:proofErr w:type="spellStart"/>
+            <w:r>
+              <w:rPr>
+                <w:rFonts w:asciiTheme="minorHAnsi" w:hAnsiTheme="minorHAnsi"/>
+              </w:rPr>
+              <w:t>img_interconnection</w:t>
+            </w:r>
+            <w:proofErr w:type="spellEnd"/>
+            <w:r>
+              <w:rPr>
+                <w:rFonts w:asciiTheme="minorHAnsi" w:hAnsiTheme="minorHAnsi"/>
+              </w:rPr>
+              <w:t>}</w:t>
+            </w:r>
           </w:p>
         </w:tc>
       </w:tr>
@@ -4111,6 +4674,26 @@
               </w:rPr>
               <w:t xml:space="preserve">                     </w:t>
             </w:r>
+            <w:r>
+              <w:rPr>
+                <w:rFonts w:asciiTheme="minorHAnsi" w:hAnsiTheme="minorHAnsi"/>
+              </w:rPr>
+              <w:t>{%</w:t>
+            </w:r>
+            <w:proofErr w:type="spellStart"/>
+            <w:r>
+              <w:rPr>
+                <w:rFonts w:asciiTheme="minorHAnsi" w:hAnsiTheme="minorHAnsi"/>
+              </w:rPr>
+              <w:t>img_housekeeping</w:t>
+            </w:r>
+            <w:proofErr w:type="spellEnd"/>
+            <w:r>
+              <w:rPr>
+                <w:rFonts w:asciiTheme="minorHAnsi" w:hAnsiTheme="minorHAnsi"/>
+              </w:rPr>
+              <w:t>}</w:t>
+            </w:r>
           </w:p>
           <w:p>
             <w:pPr>
@@ -4139,34 +4722,6 @@
           <w:rFonts w:asciiTheme="minorHAnsi" w:hAnsiTheme="minorHAnsi"/>
           <w:sz w:val="20"/>
           <w:lang w:val="en-MY"/>
-        </w:rPr>
-      </w:pPr>
-    </w:p>
-    <w:p>
-      <w:pPr>
-        <w:overflowPunct/>
-        <w:autoSpaceDE/>
-        <w:autoSpaceDN/>
-        <w:adjustRightInd/>
-        <w:textAlignment w:val="auto"/>
-        <w:rPr>
-          <w:rFonts w:asciiTheme="minorHAnsi" w:hAnsiTheme="minorHAnsi" w:cs="Arial"/>
-          <w:b/>
-          <w:bCs/>
-        </w:rPr>
-      </w:pPr>
-    </w:p>
-    <w:p>
-      <w:pPr>
-        <w:overflowPunct/>
-        <w:autoSpaceDE/>
-        <w:autoSpaceDN/>
-        <w:adjustRightInd/>
-        <w:textAlignment w:val="auto"/>
-        <w:rPr>
-          <w:rFonts w:asciiTheme="minorHAnsi" w:hAnsiTheme="minorHAnsi" w:cs="Arial"/>
-          <w:b/>
-          <w:bCs/>
         </w:rPr>
       </w:pPr>
     </w:p>
@@ -20080,7 +20635,20 @@
               </w:rPr>
             </w:pPr>
             <w:r>
-              <w:t>Hospital: {hospitalName} (Ph: {hospitalPhone})</w:t>
+              <w:t>Hospital:</w:t>
+            </w:r>
+            <w:r>
+              <w:rPr>
+                <w:spacing w:val="-7"/>
+              </w:rPr>
+              <w:t xml:space="preserve"> </w:t>
+            </w:r>
+            <w:r>
+              <w:rPr>
+                <w:spacing w:val="-7"/>
+                <w:lang w:val="en-MY"/>
+              </w:rPr>
+              <w:t>Damansara Specialist Hospital</w:t>
             </w:r>
           </w:p>
         </w:tc>
@@ -20141,7 +20709,53 @@
               </w:rPr>
             </w:pPr>
             <w:r>
-              <w:t>Nearest Clinic: {clinicName} (Ph: {clinicPhone})</w:t>
+              <w:rPr>
+                <w:lang w:val="en-MY"/>
+              </w:rPr>
+              <w:t>Nearest</w:t>
+            </w:r>
+            <w:r>
+              <w:rPr>
+                <w:spacing w:val="-5"/>
+                <w:lang w:val="en-MY"/>
+              </w:rPr>
+              <w:t xml:space="preserve"> </w:t>
+            </w:r>
+            <w:r>
+              <w:rPr>
+                <w:lang w:val="en-MY"/>
+              </w:rPr>
+              <w:t>Clinic:</w:t>
+            </w:r>
+            <w:r>
+              <w:rPr>
+                <w:spacing w:val="-4"/>
+                <w:lang w:val="en-MY"/>
+              </w:rPr>
+              <w:t xml:space="preserve"> </w:t>
+            </w:r>
+            <w:r>
+              <w:rPr>
+                <w:spacing w:val="-4"/>
+                <w:lang w:val="en-MY"/>
+              </w:rPr>
+              <w:t xml:space="preserve">Klinik </w:t>
+            </w:r>
+            <w:proofErr w:type="spellStart"/>
+            <w:r>
+              <w:rPr>
+                <w:spacing w:val="-4"/>
+                <w:lang w:val="en-MY"/>
+              </w:rPr>
+              <w:t>Medilove</w:t>
+            </w:r>
+            <w:proofErr w:type="spellEnd"/>
+            <w:r>
+              <w:rPr>
+                <w:spacing w:val="-4"/>
+                <w:lang w:val="en-MY"/>
+              </w:rPr>
+              <w:t xml:space="preserve"> Damansara Uptown</w:t>
             </w:r>
           </w:p>
         </w:tc>
@@ -20199,7 +20813,29 @@
               </w:rPr>
             </w:pPr>
             <w:r>
-              <w:t>Nearest BOMBA: {fireName} (Ph: {firePhone})</w:t>
+              <w:t>Nearest</w:t>
+            </w:r>
+            <w:r>
+              <w:rPr>
+                <w:spacing w:val="-9"/>
+              </w:rPr>
+              <w:t xml:space="preserve"> </w:t>
+            </w:r>
+            <w:r>
+              <w:t>BOMBA:</w:t>
+            </w:r>
+            <w:r>
+              <w:rPr>
+                <w:spacing w:val="-8"/>
+              </w:rPr>
+              <w:t xml:space="preserve"> </w:t>
+            </w:r>
+            <w:r>
+              <w:rPr>
+                <w:spacing w:val="-8"/>
+                <w:lang w:val="en-MY"/>
+              </w:rPr>
+              <w:t>Damansara Fire and Rescue Station</w:t>
             </w:r>
           </w:p>
         </w:tc>
@@ -20257,7 +20893,38 @@
               </w:rPr>
             </w:pPr>
             <w:r>
-              <w:t>Nearest Polis station: {policeName} (Ph: {policePhone})</w:t>
+              <w:t>Nearest</w:t>
+            </w:r>
+            <w:r>
+              <w:rPr>
+                <w:spacing w:val="-8"/>
+              </w:rPr>
+              <w:t xml:space="preserve"> </w:t>
+            </w:r>
+            <w:r>
+              <w:t>Polis</w:t>
+            </w:r>
+            <w:r>
+              <w:rPr>
+                <w:spacing w:val="-8"/>
+              </w:rPr>
+              <w:t xml:space="preserve"> </w:t>
+            </w:r>
+            <w:r>
+              <w:t>station:</w:t>
+            </w:r>
+            <w:r>
+              <w:rPr>
+                <w:spacing w:val="-7"/>
+              </w:rPr>
+              <w:t xml:space="preserve"> </w:t>
+            </w:r>
+            <w:r>
+              <w:rPr>
+                <w:spacing w:val="-7"/>
+                <w:lang w:val="en-MY"/>
+              </w:rPr>
+              <w:t>Damansara Police Station</w:t>
             </w:r>
           </w:p>
         </w:tc>
@@ -23913,6 +24580,26 @@
                 <w:rFonts w:asciiTheme="minorHAnsi" w:hAnsiTheme="minorHAnsi"/>
               </w:rPr>
             </w:pPr>
+            <w:r>
+              <w:rPr>
+                <w:rFonts w:asciiTheme="minorHAnsi" w:hAnsiTheme="minorHAnsi"/>
+              </w:rPr>
+              <w:t>{%</w:t>
+            </w:r>
+            <w:proofErr w:type="spellStart"/>
+            <w:r>
+              <w:rPr>
+                <w:rFonts w:asciiTheme="minorHAnsi" w:hAnsiTheme="minorHAnsi"/>
+              </w:rPr>
+              <w:t>img_toolbox</w:t>
+            </w:r>
+            <w:proofErr w:type="spellEnd"/>
+            <w:r>
+              <w:rPr>
+                <w:rFonts w:asciiTheme="minorHAnsi" w:hAnsiTheme="minorHAnsi"/>
+              </w:rPr>
+              <w:t>}</w:t>
+            </w:r>
           </w:p>
           <w:p>
             <w:pPr>
@@ -24005,6 +24692,26 @@
                 <w:rFonts w:asciiTheme="minorHAnsi" w:hAnsiTheme="minorHAnsi"/>
               </w:rPr>
               <w:t xml:space="preserve">                                </w:t>
+            </w:r>
+            <w:r>
+              <w:rPr>
+                <w:rFonts w:asciiTheme="minorHAnsi" w:hAnsiTheme="minorHAnsi"/>
+              </w:rPr>
+              <w:t>{%</w:t>
+            </w:r>
+            <w:proofErr w:type="spellStart"/>
+            <w:r>
+              <w:rPr>
+                <w:rFonts w:asciiTheme="minorHAnsi" w:hAnsiTheme="minorHAnsi"/>
+              </w:rPr>
+              <w:t>img_safety</w:t>
+            </w:r>
+            <w:proofErr w:type="spellEnd"/>
+            <w:r>
+              <w:rPr>
+                <w:rFonts w:asciiTheme="minorHAnsi" w:hAnsiTheme="minorHAnsi"/>
+              </w:rPr>
+              <w:t>}</w:t>
             </w:r>
           </w:p>
           <w:p>
@@ -24144,6 +24851,26 @@
                 <w:lang w:val="en-MY"/>
               </w:rPr>
             </w:pPr>
+            <w:r>
+              <w:rPr>
+                <w:rFonts w:asciiTheme="minorHAnsi" w:hAnsiTheme="minorHAnsi"/>
+              </w:rPr>
+              <w:t>{%</w:t>
+            </w:r>
+            <w:proofErr w:type="spellStart"/>
+            <w:r>
+              <w:rPr>
+                <w:rFonts w:asciiTheme="minorHAnsi" w:hAnsiTheme="minorHAnsi"/>
+              </w:rPr>
+              <w:t>img_inspection</w:t>
+            </w:r>
+            <w:proofErr w:type="spellEnd"/>
+            <w:r>
+              <w:rPr>
+                <w:rFonts w:asciiTheme="minorHAnsi" w:hAnsiTheme="minorHAnsi"/>
+              </w:rPr>
+              <w:t>}</w:t>
+            </w:r>
           </w:p>
           <w:p>
             <w:pPr>
@@ -24219,6 +24946,12 @@
                 <w:rFonts w:asciiTheme="minorHAnsi" w:hAnsiTheme="minorHAnsi"/>
               </w:rPr>
               <w:t xml:space="preserve">                                              </w:t>
+            </w:r>
+            <w:r>
+              <w:rPr>
+                <w:rFonts w:asciiTheme="minorHAnsi" w:hAnsiTheme="minorHAnsi"/>
+              </w:rPr>
+              <w:t>{%img_skylift}</w:t>
             </w:r>
           </w:p>
           <w:p>
@@ -39384,6 +40117,155 @@
     </w:lvl>
   </w:abstractNum>
   <w:abstractNum w:abstractNumId="12" w15:restartNumberingAfterBreak="0">
+    <w:nsid w:val="2BE35D15"/>
+    <w:multiLevelType w:val="multilevel"/>
+    <w:tmpl w:val="84A63C58"/>
+    <w:lvl w:ilvl="0">
+      <w:start w:val="1"/>
+      <w:numFmt w:val="bullet"/>
+      <w:lvlText w:val=""/>
+      <w:lvlJc w:val="left"/>
+      <w:pPr>
+        <w:tabs>
+          <w:tab w:val="num" w:pos="720"/>
+        </w:tabs>
+        <w:ind w:left="720" w:hanging="360"/>
+      </w:pPr>
+      <w:rPr>
+        <w:rFonts w:ascii="Symbol" w:hAnsi="Symbol" w:hint="default"/>
+        <w:sz w:val="20"/>
+      </w:rPr>
+    </w:lvl>
+    <w:lvl w:ilvl="1" w:tentative="1">
+      <w:start w:val="1"/>
+      <w:numFmt w:val="bullet"/>
+      <w:lvlText w:val=""/>
+      <w:lvlJc w:val="left"/>
+      <w:pPr>
+        <w:tabs>
+          <w:tab w:val="num" w:pos="1440"/>
+        </w:tabs>
+        <w:ind w:left="1440" w:hanging="360"/>
+      </w:pPr>
+      <w:rPr>
+        <w:rFonts w:ascii="Symbol" w:hAnsi="Symbol" w:hint="default"/>
+        <w:sz w:val="20"/>
+      </w:rPr>
+    </w:lvl>
+    <w:lvl w:ilvl="2" w:tentative="1">
+      <w:start w:val="1"/>
+      <w:numFmt w:val="bullet"/>
+      <w:lvlText w:val=""/>
+      <w:lvlJc w:val="left"/>
+      <w:pPr>
+        <w:tabs>
+          <w:tab w:val="num" w:pos="2160"/>
+        </w:tabs>
+        <w:ind w:left="2160" w:hanging="360"/>
+      </w:pPr>
+      <w:rPr>
+        <w:rFonts w:ascii="Symbol" w:hAnsi="Symbol" w:hint="default"/>
+        <w:sz w:val="20"/>
+      </w:rPr>
+    </w:lvl>
+    <w:lvl w:ilvl="3" w:tentative="1">
+      <w:start w:val="1"/>
+      <w:numFmt w:val="bullet"/>
+      <w:lvlText w:val=""/>
+      <w:lvlJc w:val="left"/>
+      <w:pPr>
+        <w:tabs>
+          <w:tab w:val="num" w:pos="2880"/>
+        </w:tabs>
+        <w:ind w:left="2880" w:hanging="360"/>
+      </w:pPr>
+      <w:rPr>
+        <w:rFonts w:ascii="Symbol" w:hAnsi="Symbol" w:hint="default"/>
+        <w:sz w:val="20"/>
+      </w:rPr>
+    </w:lvl>
+    <w:lvl w:ilvl="4" w:tentative="1">
+      <w:start w:val="1"/>
+      <w:numFmt w:val="bullet"/>
+      <w:lvlText w:val=""/>
+      <w:lvlJc w:val="left"/>
+      <w:pPr>
+        <w:tabs>
+          <w:tab w:val="num" w:pos="3600"/>
+        </w:tabs>
+        <w:ind w:left="3600" w:hanging="360"/>
+      </w:pPr>
+      <w:rPr>
+        <w:rFonts w:ascii="Symbol" w:hAnsi="Symbol" w:hint="default"/>
+        <w:sz w:val="20"/>
+      </w:rPr>
+    </w:lvl>
+    <w:lvl w:ilvl="5" w:tentative="1">
+      <w:start w:val="1"/>
+      <w:numFmt w:val="bullet"/>
+      <w:lvlText w:val=""/>
+      <w:lvlJc w:val="left"/>
+      <w:pPr>
+        <w:tabs>
+          <w:tab w:val="num" w:pos="4320"/>
+        </w:tabs>
+        <w:ind w:left="4320" w:hanging="360"/>
+      </w:pPr>
+      <w:rPr>
+        <w:rFonts w:ascii="Symbol" w:hAnsi="Symbol" w:hint="default"/>
+        <w:sz w:val="20"/>
+      </w:rPr>
+    </w:lvl>
+    <w:lvl w:ilvl="6" w:tentative="1">
+      <w:start w:val="1"/>
+      <w:numFmt w:val="bullet"/>
+      <w:lvlText w:val=""/>
+      <w:lvlJc w:val="left"/>
+      <w:pPr>
+        <w:tabs>
+          <w:tab w:val="num" w:pos="5040"/>
+        </w:tabs>
+        <w:ind w:left="5040" w:hanging="360"/>
+      </w:pPr>
+      <w:rPr>
+        <w:rFonts w:ascii="Symbol" w:hAnsi="Symbol" w:hint="default"/>
+        <w:sz w:val="20"/>
+      </w:rPr>
+    </w:lvl>
+    <w:lvl w:ilvl="7" w:tentative="1">
+      <w:start w:val="1"/>
+      <w:numFmt w:val="bullet"/>
+      <w:lvlText w:val=""/>
+      <w:lvlJc w:val="left"/>
+      <w:pPr>
+        <w:tabs>
+          <w:tab w:val="num" w:pos="5760"/>
+        </w:tabs>
+        <w:ind w:left="5760" w:hanging="360"/>
+      </w:pPr>
+      <w:rPr>
+        <w:rFonts w:ascii="Symbol" w:hAnsi="Symbol" w:hint="default"/>
+        <w:sz w:val="20"/>
+      </w:rPr>
+    </w:lvl>
+    <w:lvl w:ilvl="8" w:tentative="1">
+      <w:start w:val="1"/>
+      <w:numFmt w:val="bullet"/>
+      <w:lvlText w:val=""/>
+      <w:lvlJc w:val="left"/>
+      <w:pPr>
+        <w:tabs>
+          <w:tab w:val="num" w:pos="6480"/>
+        </w:tabs>
+        <w:ind w:left="6480" w:hanging="360"/>
+      </w:pPr>
+      <w:rPr>
+        <w:rFonts w:ascii="Symbol" w:hAnsi="Symbol" w:hint="default"/>
+        <w:sz w:val="20"/>
+      </w:rPr>
+    </w:lvl>
+  </w:abstractNum>
+  <w:abstractNum w:abstractNumId="13" w15:restartNumberingAfterBreak="0">
     <w:nsid w:val="2CE4734A"/>
     <w:multiLevelType w:val="multilevel"/>
     <w:tmpl w:val="58427752"/>
@@ -39496,7 +40378,7 @@
       </w:rPr>
     </w:lvl>
   </w:abstractNum>
-  <w:abstractNum w:abstractNumId="13" w15:restartNumberingAfterBreak="0">
+  <w:abstractNum w:abstractNumId="14" w15:restartNumberingAfterBreak="0">
     <w:nsid w:val="334C1D2D"/>
     <w:multiLevelType w:val="hybridMultilevel"/>
     <w:tmpl w:val="03A40B0C"/>
@@ -39609,7 +40491,7 @@
       </w:rPr>
     </w:lvl>
   </w:abstractNum>
-  <w:abstractNum w:abstractNumId="14" w15:restartNumberingAfterBreak="0">
+  <w:abstractNum w:abstractNumId="15" w15:restartNumberingAfterBreak="0">
     <w:nsid w:val="3EDB15A2"/>
     <w:multiLevelType w:val="multilevel"/>
     <w:tmpl w:val="3E081B0A"/>
@@ -39722,7 +40604,7 @@
       </w:rPr>
     </w:lvl>
   </w:abstractNum>
-  <w:abstractNum w:abstractNumId="15" w15:restartNumberingAfterBreak="0">
+  <w:abstractNum w:abstractNumId="16" w15:restartNumberingAfterBreak="0">
     <w:nsid w:val="44442B0C"/>
     <w:multiLevelType w:val="hybridMultilevel"/>
     <w:tmpl w:val="292E279C"/>
@@ -39844,7 +40726,7 @@
       </w:rPr>
     </w:lvl>
   </w:abstractNum>
-  <w:abstractNum w:abstractNumId="16" w15:restartNumberingAfterBreak="0">
+  <w:abstractNum w:abstractNumId="17" w15:restartNumberingAfterBreak="0">
     <w:nsid w:val="48A70552"/>
     <w:multiLevelType w:val="hybridMultilevel"/>
     <w:tmpl w:val="FCBAEE0A"/>
@@ -39930,7 +40812,305 @@
       </w:pPr>
     </w:lvl>
   </w:abstractNum>
-  <w:abstractNum w:abstractNumId="17" w15:restartNumberingAfterBreak="0">
+  <w:abstractNum w:abstractNumId="18" w15:restartNumberingAfterBreak="0">
+    <w:nsid w:val="50EC426B"/>
+    <w:multiLevelType w:val="multilevel"/>
+    <w:tmpl w:val="82EADB90"/>
+    <w:lvl w:ilvl="0">
+      <w:start w:val="1"/>
+      <w:numFmt w:val="bullet"/>
+      <w:lvlText w:val=""/>
+      <w:lvlJc w:val="left"/>
+      <w:pPr>
+        <w:tabs>
+          <w:tab w:val="num" w:pos="720"/>
+        </w:tabs>
+        <w:ind w:left="720" w:hanging="360"/>
+      </w:pPr>
+      <w:rPr>
+        <w:rFonts w:ascii="Symbol" w:hAnsi="Symbol" w:hint="default"/>
+        <w:sz w:val="20"/>
+      </w:rPr>
+    </w:lvl>
+    <w:lvl w:ilvl="1" w:tentative="1">
+      <w:start w:val="1"/>
+      <w:numFmt w:val="bullet"/>
+      <w:lvlText w:val=""/>
+      <w:lvlJc w:val="left"/>
+      <w:pPr>
+        <w:tabs>
+          <w:tab w:val="num" w:pos="1440"/>
+        </w:tabs>
+        <w:ind w:left="1440" w:hanging="360"/>
+      </w:pPr>
+      <w:rPr>
+        <w:rFonts w:ascii="Symbol" w:hAnsi="Symbol" w:hint="default"/>
+        <w:sz w:val="20"/>
+      </w:rPr>
+    </w:lvl>
+    <w:lvl w:ilvl="2" w:tentative="1">
+      <w:start w:val="1"/>
+      <w:numFmt w:val="bullet"/>
+      <w:lvlText w:val=""/>
+      <w:lvlJc w:val="left"/>
+      <w:pPr>
+        <w:tabs>
+          <w:tab w:val="num" w:pos="2160"/>
+        </w:tabs>
+        <w:ind w:left="2160" w:hanging="360"/>
+      </w:pPr>
+      <w:rPr>
+        <w:rFonts w:ascii="Symbol" w:hAnsi="Symbol" w:hint="default"/>
+        <w:sz w:val="20"/>
+      </w:rPr>
+    </w:lvl>
+    <w:lvl w:ilvl="3" w:tentative="1">
+      <w:start w:val="1"/>
+      <w:numFmt w:val="bullet"/>
+      <w:lvlText w:val=""/>
+      <w:lvlJc w:val="left"/>
+      <w:pPr>
+        <w:tabs>
+          <w:tab w:val="num" w:pos="2880"/>
+        </w:tabs>
+        <w:ind w:left="2880" w:hanging="360"/>
+      </w:pPr>
+      <w:rPr>
+        <w:rFonts w:ascii="Symbol" w:hAnsi="Symbol" w:hint="default"/>
+        <w:sz w:val="20"/>
+      </w:rPr>
+    </w:lvl>
+    <w:lvl w:ilvl="4" w:tentative="1">
+      <w:start w:val="1"/>
+      <w:numFmt w:val="bullet"/>
+      <w:lvlText w:val=""/>
+      <w:lvlJc w:val="left"/>
+      <w:pPr>
+        <w:tabs>
+          <w:tab w:val="num" w:pos="3600"/>
+        </w:tabs>
+        <w:ind w:left="3600" w:hanging="360"/>
+      </w:pPr>
+      <w:rPr>
+        <w:rFonts w:ascii="Symbol" w:hAnsi="Symbol" w:hint="default"/>
+        <w:sz w:val="20"/>
+      </w:rPr>
+    </w:lvl>
+    <w:lvl w:ilvl="5" w:tentative="1">
+      <w:start w:val="1"/>
+      <w:numFmt w:val="bullet"/>
+      <w:lvlText w:val=""/>
+      <w:lvlJc w:val="left"/>
+      <w:pPr>
+        <w:tabs>
+          <w:tab w:val="num" w:pos="4320"/>
+        </w:tabs>
+        <w:ind w:left="4320" w:hanging="360"/>
+      </w:pPr>
+      <w:rPr>
+        <w:rFonts w:ascii="Symbol" w:hAnsi="Symbol" w:hint="default"/>
+        <w:sz w:val="20"/>
+      </w:rPr>
+    </w:lvl>
+    <w:lvl w:ilvl="6" w:tentative="1">
+      <w:start w:val="1"/>
+      <w:numFmt w:val="bullet"/>
+      <w:lvlText w:val=""/>
+      <w:lvlJc w:val="left"/>
+      <w:pPr>
+        <w:tabs>
+          <w:tab w:val="num" w:pos="5040"/>
+        </w:tabs>
+        <w:ind w:left="5040" w:hanging="360"/>
+      </w:pPr>
+      <w:rPr>
+        <w:rFonts w:ascii="Symbol" w:hAnsi="Symbol" w:hint="default"/>
+        <w:sz w:val="20"/>
+      </w:rPr>
+    </w:lvl>
+    <w:lvl w:ilvl="7" w:tentative="1">
+      <w:start w:val="1"/>
+      <w:numFmt w:val="bullet"/>
+      <w:lvlText w:val=""/>
+      <w:lvlJc w:val="left"/>
+      <w:pPr>
+        <w:tabs>
+          <w:tab w:val="num" w:pos="5760"/>
+        </w:tabs>
+        <w:ind w:left="5760" w:hanging="360"/>
+      </w:pPr>
+      <w:rPr>
+        <w:rFonts w:ascii="Symbol" w:hAnsi="Symbol" w:hint="default"/>
+        <w:sz w:val="20"/>
+      </w:rPr>
+    </w:lvl>
+    <w:lvl w:ilvl="8" w:tentative="1">
+      <w:start w:val="1"/>
+      <w:numFmt w:val="bullet"/>
+      <w:lvlText w:val=""/>
+      <w:lvlJc w:val="left"/>
+      <w:pPr>
+        <w:tabs>
+          <w:tab w:val="num" w:pos="6480"/>
+        </w:tabs>
+        <w:ind w:left="6480" w:hanging="360"/>
+      </w:pPr>
+      <w:rPr>
+        <w:rFonts w:ascii="Symbol" w:hAnsi="Symbol" w:hint="default"/>
+        <w:sz w:val="20"/>
+      </w:rPr>
+    </w:lvl>
+  </w:abstractNum>
+  <w:abstractNum w:abstractNumId="19" w15:restartNumberingAfterBreak="0">
+    <w:nsid w:val="528C0787"/>
+    <w:multiLevelType w:val="multilevel"/>
+    <w:tmpl w:val="ED1832DC"/>
+    <w:lvl w:ilvl="0">
+      <w:start w:val="1"/>
+      <w:numFmt w:val="bullet"/>
+      <w:lvlText w:val=""/>
+      <w:lvlJc w:val="left"/>
+      <w:pPr>
+        <w:tabs>
+          <w:tab w:val="num" w:pos="720"/>
+        </w:tabs>
+        <w:ind w:left="720" w:hanging="360"/>
+      </w:pPr>
+      <w:rPr>
+        <w:rFonts w:ascii="Symbol" w:hAnsi="Symbol" w:hint="default"/>
+        <w:sz w:val="20"/>
+      </w:rPr>
+    </w:lvl>
+    <w:lvl w:ilvl="1" w:tentative="1">
+      <w:start w:val="1"/>
+      <w:numFmt w:val="bullet"/>
+      <w:lvlText w:val=""/>
+      <w:lvlJc w:val="left"/>
+      <w:pPr>
+        <w:tabs>
+          <w:tab w:val="num" w:pos="1440"/>
+        </w:tabs>
+        <w:ind w:left="1440" w:hanging="360"/>
+      </w:pPr>
+      <w:rPr>
+        <w:rFonts w:ascii="Symbol" w:hAnsi="Symbol" w:hint="default"/>
+        <w:sz w:val="20"/>
+      </w:rPr>
+    </w:lvl>
+    <w:lvl w:ilvl="2" w:tentative="1">
+      <w:start w:val="1"/>
+      <w:numFmt w:val="bullet"/>
+      <w:lvlText w:val=""/>
+      <w:lvlJc w:val="left"/>
+      <w:pPr>
+        <w:tabs>
+          <w:tab w:val="num" w:pos="2160"/>
+        </w:tabs>
+        <w:ind w:left="2160" w:hanging="360"/>
+      </w:pPr>
+      <w:rPr>
+        <w:rFonts w:ascii="Symbol" w:hAnsi="Symbol" w:hint="default"/>
+        <w:sz w:val="20"/>
+      </w:rPr>
+    </w:lvl>
+    <w:lvl w:ilvl="3" w:tentative="1">
+      <w:start w:val="1"/>
+      <w:numFmt w:val="bullet"/>
+      <w:lvlText w:val=""/>
+      <w:lvlJc w:val="left"/>
+      <w:pPr>
+        <w:tabs>
+          <w:tab w:val="num" w:pos="2880"/>
+        </w:tabs>
+        <w:ind w:left="2880" w:hanging="360"/>
+      </w:pPr>
+      <w:rPr>
+        <w:rFonts w:ascii="Symbol" w:hAnsi="Symbol" w:hint="default"/>
+        <w:sz w:val="20"/>
+      </w:rPr>
+    </w:lvl>
+    <w:lvl w:ilvl="4" w:tentative="1">
+      <w:start w:val="1"/>
+      <w:numFmt w:val="bullet"/>
+      <w:lvlText w:val=""/>
+      <w:lvlJc w:val="left"/>
+      <w:pPr>
+        <w:tabs>
+          <w:tab w:val="num" w:pos="3600"/>
+        </w:tabs>
+        <w:ind w:left="3600" w:hanging="360"/>
+      </w:pPr>
+      <w:rPr>
+        <w:rFonts w:ascii="Symbol" w:hAnsi="Symbol" w:hint="default"/>
+        <w:sz w:val="20"/>
+      </w:rPr>
+    </w:lvl>
+    <w:lvl w:ilvl="5" w:tentative="1">
+      <w:start w:val="1"/>
+      <w:numFmt w:val="bullet"/>
+      <w:lvlText w:val=""/>
+      <w:lvlJc w:val="left"/>
+      <w:pPr>
+        <w:tabs>
+          <w:tab w:val="num" w:pos="4320"/>
+        </w:tabs>
+        <w:ind w:left="4320" w:hanging="360"/>
+      </w:pPr>
+      <w:rPr>
+        <w:rFonts w:ascii="Symbol" w:hAnsi="Symbol" w:hint="default"/>
+        <w:sz w:val="20"/>
+      </w:rPr>
+    </w:lvl>
+    <w:lvl w:ilvl="6" w:tentative="1">
+      <w:start w:val="1"/>
+      <w:numFmt w:val="bullet"/>
+      <w:lvlText w:val=""/>
+      <w:lvlJc w:val="left"/>
+      <w:pPr>
+        <w:tabs>
+          <w:tab w:val="num" w:pos="5040"/>
+        </w:tabs>
+        <w:ind w:left="5040" w:hanging="360"/>
+      </w:pPr>
+      <w:rPr>
+        <w:rFonts w:ascii="Symbol" w:hAnsi="Symbol" w:hint="default"/>
+        <w:sz w:val="20"/>
+      </w:rPr>
+    </w:lvl>
+    <w:lvl w:ilvl="7" w:tentative="1">
+      <w:start w:val="1"/>
+      <w:numFmt w:val="bullet"/>
+      <w:lvlText w:val=""/>
+      <w:lvlJc w:val="left"/>
+      <w:pPr>
+        <w:tabs>
+          <w:tab w:val="num" w:pos="5760"/>
+        </w:tabs>
+        <w:ind w:left="5760" w:hanging="360"/>
+      </w:pPr>
+      <w:rPr>
+        <w:rFonts w:ascii="Symbol" w:hAnsi="Symbol" w:hint="default"/>
+        <w:sz w:val="20"/>
+      </w:rPr>
+    </w:lvl>
+    <w:lvl w:ilvl="8" w:tentative="1">
+      <w:start w:val="1"/>
+      <w:numFmt w:val="bullet"/>
+      <w:lvlText w:val=""/>
+      <w:lvlJc w:val="left"/>
+      <w:pPr>
+        <w:tabs>
+          <w:tab w:val="num" w:pos="6480"/>
+        </w:tabs>
+        <w:ind w:left="6480" w:hanging="360"/>
+      </w:pPr>
+      <w:rPr>
+        <w:rFonts w:ascii="Symbol" w:hAnsi="Symbol" w:hint="default"/>
+        <w:sz w:val="20"/>
+      </w:rPr>
+    </w:lvl>
+  </w:abstractNum>
+  <w:abstractNum w:abstractNumId="20" w15:restartNumberingAfterBreak="0">
     <w:nsid w:val="57B92C92"/>
     <w:multiLevelType w:val="hybridMultilevel"/>
     <w:tmpl w:val="81041908"/>
@@ -40043,7 +41223,7 @@
       </w:rPr>
     </w:lvl>
   </w:abstractNum>
-  <w:abstractNum w:abstractNumId="18" w15:restartNumberingAfterBreak="0">
+  <w:abstractNum w:abstractNumId="21" w15:restartNumberingAfterBreak="0">
     <w:nsid w:val="583D6270"/>
     <w:multiLevelType w:val="hybridMultilevel"/>
     <w:tmpl w:val="89A88596"/>
@@ -40132,7 +41312,7 @@
       </w:pPr>
     </w:lvl>
   </w:abstractNum>
-  <w:abstractNum w:abstractNumId="19" w15:restartNumberingAfterBreak="0">
+  <w:abstractNum w:abstractNumId="22" w15:restartNumberingAfterBreak="0">
     <w:nsid w:val="5C0A244C"/>
     <w:multiLevelType w:val="hybridMultilevel"/>
     <w:tmpl w:val="42A874B6"/>
@@ -40218,7 +41398,7 @@
       </w:pPr>
     </w:lvl>
   </w:abstractNum>
-  <w:abstractNum w:abstractNumId="20" w15:restartNumberingAfterBreak="0">
+  <w:abstractNum w:abstractNumId="23" w15:restartNumberingAfterBreak="0">
     <w:nsid w:val="5E7210AF"/>
     <w:multiLevelType w:val="hybridMultilevel"/>
     <w:tmpl w:val="89A88596"/>
@@ -40307,7 +41487,7 @@
       </w:pPr>
     </w:lvl>
   </w:abstractNum>
-  <w:abstractNum w:abstractNumId="21" w15:restartNumberingAfterBreak="0">
+  <w:abstractNum w:abstractNumId="24" w15:restartNumberingAfterBreak="0">
     <w:nsid w:val="682C23FD"/>
     <w:multiLevelType w:val="hybridMultilevel"/>
     <w:tmpl w:val="08AC1534"/>
@@ -40396,7 +41576,120 @@
       </w:pPr>
     </w:lvl>
   </w:abstractNum>
-  <w:abstractNum w:abstractNumId="22" w15:restartNumberingAfterBreak="0">
+  <w:abstractNum w:abstractNumId="25" w15:restartNumberingAfterBreak="0">
+    <w:nsid w:val="6F001845"/>
+    <w:multiLevelType w:val="hybridMultilevel"/>
+    <w:tmpl w:val="6CCC512C"/>
+    <w:lvl w:ilvl="0" w:tplc="44090001">
+      <w:start w:val="1"/>
+      <w:numFmt w:val="bullet"/>
+      <w:lvlText w:val=""/>
+      <w:lvlJc w:val="left"/>
+      <w:pPr>
+        <w:ind w:left="720" w:hanging="360"/>
+      </w:pPr>
+      <w:rPr>
+        <w:rFonts w:ascii="Symbol" w:hAnsi="Symbol" w:hint="default"/>
+      </w:rPr>
+    </w:lvl>
+    <w:lvl w:ilvl="1" w:tplc="44090003" w:tentative="1">
+      <w:start w:val="1"/>
+      <w:numFmt w:val="bullet"/>
+      <w:lvlText w:val="o"/>
+      <w:lvlJc w:val="left"/>
+      <w:pPr>
+        <w:ind w:left="1440" w:hanging="360"/>
+      </w:pPr>
+      <w:rPr>
+        <w:rFonts w:ascii="Courier New" w:hAnsi="Courier New" w:cs="Courier New" w:hint="default"/>
+      </w:rPr>
+    </w:lvl>
+    <w:lvl w:ilvl="2" w:tplc="44090005" w:tentative="1">
+      <w:start w:val="1"/>
+      <w:numFmt w:val="bullet"/>
+      <w:lvlText w:val=""/>
+      <w:lvlJc w:val="left"/>
+      <w:pPr>
+        <w:ind w:left="2160" w:hanging="360"/>
+      </w:pPr>
+      <w:rPr>
+        <w:rFonts w:ascii="Wingdings" w:hAnsi="Wingdings" w:hint="default"/>
+      </w:rPr>
+    </w:lvl>
+    <w:lvl w:ilvl="3" w:tplc="44090001" w:tentative="1">
+      <w:start w:val="1"/>
+      <w:numFmt w:val="bullet"/>
+      <w:lvlText w:val=""/>
+      <w:lvlJc w:val="left"/>
+      <w:pPr>
+        <w:ind w:left="2880" w:hanging="360"/>
+      </w:pPr>
+      <w:rPr>
+        <w:rFonts w:ascii="Symbol" w:hAnsi="Symbol" w:hint="default"/>
+      </w:rPr>
+    </w:lvl>
+    <w:lvl w:ilvl="4" w:tplc="44090003" w:tentative="1">
+      <w:start w:val="1"/>
+      <w:numFmt w:val="bullet"/>
+      <w:lvlText w:val="o"/>
+      <w:lvlJc w:val="left"/>
+      <w:pPr>
+        <w:ind w:left="3600" w:hanging="360"/>
+      </w:pPr>
+      <w:rPr>
+        <w:rFonts w:ascii="Courier New" w:hAnsi="Courier New" w:cs="Courier New" w:hint="default"/>
+      </w:rPr>
+    </w:lvl>
+    <w:lvl w:ilvl="5" w:tplc="44090005" w:tentative="1">
+      <w:start w:val="1"/>
+      <w:numFmt w:val="bullet"/>
+      <w:lvlText w:val=""/>
+      <w:lvlJc w:val="left"/>
+      <w:pPr>
+        <w:ind w:left="4320" w:hanging="360"/>
+      </w:pPr>
+      <w:rPr>
+        <w:rFonts w:ascii="Wingdings" w:hAnsi="Wingdings" w:hint="default"/>
+      </w:rPr>
+    </w:lvl>
+    <w:lvl w:ilvl="6" w:tplc="44090001" w:tentative="1">
+      <w:start w:val="1"/>
+      <w:numFmt w:val="bullet"/>
+      <w:lvlText w:val=""/>
+      <w:lvlJc w:val="left"/>
+      <w:pPr>
+        <w:ind w:left="5040" w:hanging="360"/>
+      </w:pPr>
+      <w:rPr>
+        <w:rFonts w:ascii="Symbol" w:hAnsi="Symbol" w:hint="default"/>
+      </w:rPr>
+    </w:lvl>
+    <w:lvl w:ilvl="7" w:tplc="44090003" w:tentative="1">
+      <w:start w:val="1"/>
+      <w:numFmt w:val="bullet"/>
+      <w:lvlText w:val="o"/>
+      <w:lvlJc w:val="left"/>
+      <w:pPr>
+        <w:ind w:left="5760" w:hanging="360"/>
+      </w:pPr>
+      <w:rPr>
+        <w:rFonts w:ascii="Courier New" w:hAnsi="Courier New" w:cs="Courier New" w:hint="default"/>
+      </w:rPr>
+    </w:lvl>
+    <w:lvl w:ilvl="8" w:tplc="44090005" w:tentative="1">
+      <w:start w:val="1"/>
+      <w:numFmt w:val="bullet"/>
+      <w:lvlText w:val=""/>
+      <w:lvlJc w:val="left"/>
+      <w:pPr>
+        <w:ind w:left="6480" w:hanging="360"/>
+      </w:pPr>
+      <w:rPr>
+        <w:rFonts w:ascii="Wingdings" w:hAnsi="Wingdings" w:hint="default"/>
+      </w:rPr>
+    </w:lvl>
+  </w:abstractNum>
+  <w:abstractNum w:abstractNumId="26" w15:restartNumberingAfterBreak="0">
     <w:nsid w:val="73B52BEE"/>
     <w:multiLevelType w:val="hybridMultilevel"/>
     <w:tmpl w:val="F2DC97A8"/>
@@ -40482,7 +41775,454 @@
       </w:pPr>
     </w:lvl>
   </w:abstractNum>
-  <w:abstractNum w:abstractNumId="23" w15:restartNumberingAfterBreak="0">
+  <w:abstractNum w:abstractNumId="27" w15:restartNumberingAfterBreak="0">
+    <w:nsid w:val="742619EA"/>
+    <w:multiLevelType w:val="multilevel"/>
+    <w:tmpl w:val="C88429DA"/>
+    <w:lvl w:ilvl="0">
+      <w:start w:val="1"/>
+      <w:numFmt w:val="bullet"/>
+      <w:lvlText w:val=""/>
+      <w:lvlJc w:val="left"/>
+      <w:pPr>
+        <w:tabs>
+          <w:tab w:val="num" w:pos="720"/>
+        </w:tabs>
+        <w:ind w:left="720" w:hanging="360"/>
+      </w:pPr>
+      <w:rPr>
+        <w:rFonts w:ascii="Symbol" w:hAnsi="Symbol" w:hint="default"/>
+        <w:sz w:val="20"/>
+      </w:rPr>
+    </w:lvl>
+    <w:lvl w:ilvl="1" w:tentative="1">
+      <w:start w:val="1"/>
+      <w:numFmt w:val="bullet"/>
+      <w:lvlText w:val=""/>
+      <w:lvlJc w:val="left"/>
+      <w:pPr>
+        <w:tabs>
+          <w:tab w:val="num" w:pos="1440"/>
+        </w:tabs>
+        <w:ind w:left="1440" w:hanging="360"/>
+      </w:pPr>
+      <w:rPr>
+        <w:rFonts w:ascii="Symbol" w:hAnsi="Symbol" w:hint="default"/>
+        <w:sz w:val="20"/>
+      </w:rPr>
+    </w:lvl>
+    <w:lvl w:ilvl="2" w:tentative="1">
+      <w:start w:val="1"/>
+      <w:numFmt w:val="bullet"/>
+      <w:lvlText w:val=""/>
+      <w:lvlJc w:val="left"/>
+      <w:pPr>
+        <w:tabs>
+          <w:tab w:val="num" w:pos="2160"/>
+        </w:tabs>
+        <w:ind w:left="2160" w:hanging="360"/>
+      </w:pPr>
+      <w:rPr>
+        <w:rFonts w:ascii="Symbol" w:hAnsi="Symbol" w:hint="default"/>
+        <w:sz w:val="20"/>
+      </w:rPr>
+    </w:lvl>
+    <w:lvl w:ilvl="3" w:tentative="1">
+      <w:start w:val="1"/>
+      <w:numFmt w:val="bullet"/>
+      <w:lvlText w:val=""/>
+      <w:lvlJc w:val="left"/>
+      <w:pPr>
+        <w:tabs>
+          <w:tab w:val="num" w:pos="2880"/>
+        </w:tabs>
+        <w:ind w:left="2880" w:hanging="360"/>
+      </w:pPr>
+      <w:rPr>
+        <w:rFonts w:ascii="Symbol" w:hAnsi="Symbol" w:hint="default"/>
+        <w:sz w:val="20"/>
+      </w:rPr>
+    </w:lvl>
+    <w:lvl w:ilvl="4" w:tentative="1">
+      <w:start w:val="1"/>
+      <w:numFmt w:val="bullet"/>
+      <w:lvlText w:val=""/>
+      <w:lvlJc w:val="left"/>
+      <w:pPr>
+        <w:tabs>
+          <w:tab w:val="num" w:pos="3600"/>
+        </w:tabs>
+        <w:ind w:left="3600" w:hanging="360"/>
+      </w:pPr>
+      <w:rPr>
+        <w:rFonts w:ascii="Symbol" w:hAnsi="Symbol" w:hint="default"/>
+        <w:sz w:val="20"/>
+      </w:rPr>
+    </w:lvl>
+    <w:lvl w:ilvl="5" w:tentative="1">
+      <w:start w:val="1"/>
+      <w:numFmt w:val="bullet"/>
+      <w:lvlText w:val=""/>
+      <w:lvlJc w:val="left"/>
+      <w:pPr>
+        <w:tabs>
+          <w:tab w:val="num" w:pos="4320"/>
+        </w:tabs>
+        <w:ind w:left="4320" w:hanging="360"/>
+      </w:pPr>
+      <w:rPr>
+        <w:rFonts w:ascii="Symbol" w:hAnsi="Symbol" w:hint="default"/>
+        <w:sz w:val="20"/>
+      </w:rPr>
+    </w:lvl>
+    <w:lvl w:ilvl="6" w:tentative="1">
+      <w:start w:val="1"/>
+      <w:numFmt w:val="bullet"/>
+      <w:lvlText w:val=""/>
+      <w:lvlJc w:val="left"/>
+      <w:pPr>
+        <w:tabs>
+          <w:tab w:val="num" w:pos="5040"/>
+        </w:tabs>
+        <w:ind w:left="5040" w:hanging="360"/>
+      </w:pPr>
+      <w:rPr>
+        <w:rFonts w:ascii="Symbol" w:hAnsi="Symbol" w:hint="default"/>
+        <w:sz w:val="20"/>
+      </w:rPr>
+    </w:lvl>
+    <w:lvl w:ilvl="7" w:tentative="1">
+      <w:start w:val="1"/>
+      <w:numFmt w:val="bullet"/>
+      <w:lvlText w:val=""/>
+      <w:lvlJc w:val="left"/>
+      <w:pPr>
+        <w:tabs>
+          <w:tab w:val="num" w:pos="5760"/>
+        </w:tabs>
+        <w:ind w:left="5760" w:hanging="360"/>
+      </w:pPr>
+      <w:rPr>
+        <w:rFonts w:ascii="Symbol" w:hAnsi="Symbol" w:hint="default"/>
+        <w:sz w:val="20"/>
+      </w:rPr>
+    </w:lvl>
+    <w:lvl w:ilvl="8" w:tentative="1">
+      <w:start w:val="1"/>
+      <w:numFmt w:val="bullet"/>
+      <w:lvlText w:val=""/>
+      <w:lvlJc w:val="left"/>
+      <w:pPr>
+        <w:tabs>
+          <w:tab w:val="num" w:pos="6480"/>
+        </w:tabs>
+        <w:ind w:left="6480" w:hanging="360"/>
+      </w:pPr>
+      <w:rPr>
+        <w:rFonts w:ascii="Symbol" w:hAnsi="Symbol" w:hint="default"/>
+        <w:sz w:val="20"/>
+      </w:rPr>
+    </w:lvl>
+  </w:abstractNum>
+  <w:abstractNum w:abstractNumId="28" w15:restartNumberingAfterBreak="0">
+    <w:nsid w:val="7ADF0987"/>
+    <w:multiLevelType w:val="multilevel"/>
+    <w:tmpl w:val="72604E32"/>
+    <w:lvl w:ilvl="0">
+      <w:start w:val="1"/>
+      <w:numFmt w:val="bullet"/>
+      <w:lvlText w:val=""/>
+      <w:lvlJc w:val="left"/>
+      <w:pPr>
+        <w:tabs>
+          <w:tab w:val="num" w:pos="720"/>
+        </w:tabs>
+        <w:ind w:left="720" w:hanging="360"/>
+      </w:pPr>
+      <w:rPr>
+        <w:rFonts w:ascii="Symbol" w:hAnsi="Symbol" w:hint="default"/>
+        <w:sz w:val="20"/>
+      </w:rPr>
+    </w:lvl>
+    <w:lvl w:ilvl="1" w:tentative="1">
+      <w:start w:val="1"/>
+      <w:numFmt w:val="bullet"/>
+      <w:lvlText w:val=""/>
+      <w:lvlJc w:val="left"/>
+      <w:pPr>
+        <w:tabs>
+          <w:tab w:val="num" w:pos="1440"/>
+        </w:tabs>
+        <w:ind w:left="1440" w:hanging="360"/>
+      </w:pPr>
+      <w:rPr>
+        <w:rFonts w:ascii="Symbol" w:hAnsi="Symbol" w:hint="default"/>
+        <w:sz w:val="20"/>
+      </w:rPr>
+    </w:lvl>
+    <w:lvl w:ilvl="2" w:tentative="1">
+      <w:start w:val="1"/>
+      <w:numFmt w:val="bullet"/>
+      <w:lvlText w:val=""/>
+      <w:lvlJc w:val="left"/>
+      <w:pPr>
+        <w:tabs>
+          <w:tab w:val="num" w:pos="2160"/>
+        </w:tabs>
+        <w:ind w:left="2160" w:hanging="360"/>
+      </w:pPr>
+      <w:rPr>
+        <w:rFonts w:ascii="Symbol" w:hAnsi="Symbol" w:hint="default"/>
+        <w:sz w:val="20"/>
+      </w:rPr>
+    </w:lvl>
+    <w:lvl w:ilvl="3" w:tentative="1">
+      <w:start w:val="1"/>
+      <w:numFmt w:val="bullet"/>
+      <w:lvlText w:val=""/>
+      <w:lvlJc w:val="left"/>
+      <w:pPr>
+        <w:tabs>
+          <w:tab w:val="num" w:pos="2880"/>
+        </w:tabs>
+        <w:ind w:left="2880" w:hanging="360"/>
+      </w:pPr>
+      <w:rPr>
+        <w:rFonts w:ascii="Symbol" w:hAnsi="Symbol" w:hint="default"/>
+        <w:sz w:val="20"/>
+      </w:rPr>
+    </w:lvl>
+    <w:lvl w:ilvl="4" w:tentative="1">
+      <w:start w:val="1"/>
+      <w:numFmt w:val="bullet"/>
+      <w:lvlText w:val=""/>
+      <w:lvlJc w:val="left"/>
+      <w:pPr>
+        <w:tabs>
+          <w:tab w:val="num" w:pos="3600"/>
+        </w:tabs>
+        <w:ind w:left="3600" w:hanging="360"/>
+      </w:pPr>
+      <w:rPr>
+        <w:rFonts w:ascii="Symbol" w:hAnsi="Symbol" w:hint="default"/>
+        <w:sz w:val="20"/>
+      </w:rPr>
+    </w:lvl>
+    <w:lvl w:ilvl="5" w:tentative="1">
+      <w:start w:val="1"/>
+      <w:numFmt w:val="bullet"/>
+      <w:lvlText w:val=""/>
+      <w:lvlJc w:val="left"/>
+      <w:pPr>
+        <w:tabs>
+          <w:tab w:val="num" w:pos="4320"/>
+        </w:tabs>
+        <w:ind w:left="4320" w:hanging="360"/>
+      </w:pPr>
+      <w:rPr>
+        <w:rFonts w:ascii="Symbol" w:hAnsi="Symbol" w:hint="default"/>
+        <w:sz w:val="20"/>
+      </w:rPr>
+    </w:lvl>
+    <w:lvl w:ilvl="6" w:tentative="1">
+      <w:start w:val="1"/>
+      <w:numFmt w:val="bullet"/>
+      <w:lvlText w:val=""/>
+      <w:lvlJc w:val="left"/>
+      <w:pPr>
+        <w:tabs>
+          <w:tab w:val="num" w:pos="5040"/>
+        </w:tabs>
+        <w:ind w:left="5040" w:hanging="360"/>
+      </w:pPr>
+      <w:rPr>
+        <w:rFonts w:ascii="Symbol" w:hAnsi="Symbol" w:hint="default"/>
+        <w:sz w:val="20"/>
+      </w:rPr>
+    </w:lvl>
+    <w:lvl w:ilvl="7" w:tentative="1">
+      <w:start w:val="1"/>
+      <w:numFmt w:val="bullet"/>
+      <w:lvlText w:val=""/>
+      <w:lvlJc w:val="left"/>
+      <w:pPr>
+        <w:tabs>
+          <w:tab w:val="num" w:pos="5760"/>
+        </w:tabs>
+        <w:ind w:left="5760" w:hanging="360"/>
+      </w:pPr>
+      <w:rPr>
+        <w:rFonts w:ascii="Symbol" w:hAnsi="Symbol" w:hint="default"/>
+        <w:sz w:val="20"/>
+      </w:rPr>
+    </w:lvl>
+    <w:lvl w:ilvl="8" w:tentative="1">
+      <w:start w:val="1"/>
+      <w:numFmt w:val="bullet"/>
+      <w:lvlText w:val=""/>
+      <w:lvlJc w:val="left"/>
+      <w:pPr>
+        <w:tabs>
+          <w:tab w:val="num" w:pos="6480"/>
+        </w:tabs>
+        <w:ind w:left="6480" w:hanging="360"/>
+      </w:pPr>
+      <w:rPr>
+        <w:rFonts w:ascii="Symbol" w:hAnsi="Symbol" w:hint="default"/>
+        <w:sz w:val="20"/>
+      </w:rPr>
+    </w:lvl>
+  </w:abstractNum>
+  <w:abstractNum w:abstractNumId="29" w15:restartNumberingAfterBreak="0">
+    <w:nsid w:val="7B9839E8"/>
+    <w:multiLevelType w:val="multilevel"/>
+    <w:tmpl w:val="887C8D8A"/>
+    <w:lvl w:ilvl="0">
+      <w:start w:val="1"/>
+      <w:numFmt w:val="bullet"/>
+      <w:lvlText w:val=""/>
+      <w:lvlJc w:val="left"/>
+      <w:pPr>
+        <w:tabs>
+          <w:tab w:val="num" w:pos="720"/>
+        </w:tabs>
+        <w:ind w:left="720" w:hanging="360"/>
+      </w:pPr>
+      <w:rPr>
+        <w:rFonts w:ascii="Symbol" w:hAnsi="Symbol" w:hint="default"/>
+        <w:sz w:val="20"/>
+      </w:rPr>
+    </w:lvl>
+    <w:lvl w:ilvl="1" w:tentative="1">
+      <w:start w:val="1"/>
+      <w:numFmt w:val="bullet"/>
+      <w:lvlText w:val=""/>
+      <w:lvlJc w:val="left"/>
+      <w:pPr>
+        <w:tabs>
+          <w:tab w:val="num" w:pos="1440"/>
+        </w:tabs>
+        <w:ind w:left="1440" w:hanging="360"/>
+      </w:pPr>
+      <w:rPr>
+        <w:rFonts w:ascii="Symbol" w:hAnsi="Symbol" w:hint="default"/>
+        <w:sz w:val="20"/>
+      </w:rPr>
+    </w:lvl>
+    <w:lvl w:ilvl="2" w:tentative="1">
+      <w:start w:val="1"/>
+      <w:numFmt w:val="bullet"/>
+      <w:lvlText w:val=""/>
+      <w:lvlJc w:val="left"/>
+      <w:pPr>
+        <w:tabs>
+          <w:tab w:val="num" w:pos="2160"/>
+        </w:tabs>
+        <w:ind w:left="2160" w:hanging="360"/>
+      </w:pPr>
+      <w:rPr>
+        <w:rFonts w:ascii="Symbol" w:hAnsi="Symbol" w:hint="default"/>
+        <w:sz w:val="20"/>
+      </w:rPr>
+    </w:lvl>
+    <w:lvl w:ilvl="3" w:tentative="1">
+      <w:start w:val="1"/>
+      <w:numFmt w:val="bullet"/>
+      <w:lvlText w:val=""/>
+      <w:lvlJc w:val="left"/>
+      <w:pPr>
+        <w:tabs>
+          <w:tab w:val="num" w:pos="2880"/>
+        </w:tabs>
+        <w:ind w:left="2880" w:hanging="360"/>
+      </w:pPr>
+      <w:rPr>
+        <w:rFonts w:ascii="Symbol" w:hAnsi="Symbol" w:hint="default"/>
+        <w:sz w:val="20"/>
+      </w:rPr>
+    </w:lvl>
+    <w:lvl w:ilvl="4" w:tentative="1">
+      <w:start w:val="1"/>
+      <w:numFmt w:val="bullet"/>
+      <w:lvlText w:val=""/>
+      <w:lvlJc w:val="left"/>
+      <w:pPr>
+        <w:tabs>
+          <w:tab w:val="num" w:pos="3600"/>
+        </w:tabs>
+        <w:ind w:left="3600" w:hanging="360"/>
+      </w:pPr>
+      <w:rPr>
+        <w:rFonts w:ascii="Symbol" w:hAnsi="Symbol" w:hint="default"/>
+        <w:sz w:val="20"/>
+      </w:rPr>
+    </w:lvl>
+    <w:lvl w:ilvl="5" w:tentative="1">
+      <w:start w:val="1"/>
+      <w:numFmt w:val="bullet"/>
+      <w:lvlText w:val=""/>
+      <w:lvlJc w:val="left"/>
+      <w:pPr>
+        <w:tabs>
+          <w:tab w:val="num" w:pos="4320"/>
+        </w:tabs>
+        <w:ind w:left="4320" w:hanging="360"/>
+      </w:pPr>
+      <w:rPr>
+        <w:rFonts w:ascii="Symbol" w:hAnsi="Symbol" w:hint="default"/>
+        <w:sz w:val="20"/>
+      </w:rPr>
+    </w:lvl>
+    <w:lvl w:ilvl="6" w:tentative="1">
+      <w:start w:val="1"/>
+      <w:numFmt w:val="bullet"/>
+      <w:lvlText w:val=""/>
+      <w:lvlJc w:val="left"/>
+      <w:pPr>
+        <w:tabs>
+          <w:tab w:val="num" w:pos="5040"/>
+        </w:tabs>
+        <w:ind w:left="5040" w:hanging="360"/>
+      </w:pPr>
+      <w:rPr>
+        <w:rFonts w:ascii="Symbol" w:hAnsi="Symbol" w:hint="default"/>
+        <w:sz w:val="20"/>
+      </w:rPr>
+    </w:lvl>
+    <w:lvl w:ilvl="7" w:tentative="1">
+      <w:start w:val="1"/>
+      <w:numFmt w:val="bullet"/>
+      <w:lvlText w:val=""/>
+      <w:lvlJc w:val="left"/>
+      <w:pPr>
+        <w:tabs>
+          <w:tab w:val="num" w:pos="5760"/>
+        </w:tabs>
+        <w:ind w:left="5760" w:hanging="360"/>
+      </w:pPr>
+      <w:rPr>
+        <w:rFonts w:ascii="Symbol" w:hAnsi="Symbol" w:hint="default"/>
+        <w:sz w:val="20"/>
+      </w:rPr>
+    </w:lvl>
+    <w:lvl w:ilvl="8" w:tentative="1">
+      <w:start w:val="1"/>
+      <w:numFmt w:val="bullet"/>
+      <w:lvlText w:val=""/>
+      <w:lvlJc w:val="left"/>
+      <w:pPr>
+        <w:tabs>
+          <w:tab w:val="num" w:pos="6480"/>
+        </w:tabs>
+        <w:ind w:left="6480" w:hanging="360"/>
+      </w:pPr>
+      <w:rPr>
+        <w:rFonts w:ascii="Symbol" w:hAnsi="Symbol" w:hint="default"/>
+        <w:sz w:val="20"/>
+      </w:rPr>
+    </w:lvl>
+  </w:abstractNum>
+  <w:abstractNum w:abstractNumId="30" w15:restartNumberingAfterBreak="0">
     <w:nsid w:val="7C256F43"/>
     <w:multiLevelType w:val="multilevel"/>
     <w:tmpl w:val="9D7E5F0A"/>
@@ -40594,6 +42334,155 @@
       </w:pPr>
       <w:rPr>
         <w:rFonts w:hint="default"/>
+      </w:rPr>
+    </w:lvl>
+  </w:abstractNum>
+  <w:abstractNum w:abstractNumId="31" w15:restartNumberingAfterBreak="0">
+    <w:nsid w:val="7CC14C17"/>
+    <w:multiLevelType w:val="multilevel"/>
+    <w:tmpl w:val="CAA6F422"/>
+    <w:lvl w:ilvl="0">
+      <w:start w:val="1"/>
+      <w:numFmt w:val="bullet"/>
+      <w:lvlText w:val=""/>
+      <w:lvlJc w:val="left"/>
+      <w:pPr>
+        <w:tabs>
+          <w:tab w:val="num" w:pos="720"/>
+        </w:tabs>
+        <w:ind w:left="720" w:hanging="360"/>
+      </w:pPr>
+      <w:rPr>
+        <w:rFonts w:ascii="Symbol" w:hAnsi="Symbol" w:hint="default"/>
+        <w:sz w:val="20"/>
+      </w:rPr>
+    </w:lvl>
+    <w:lvl w:ilvl="1" w:tentative="1">
+      <w:start w:val="1"/>
+      <w:numFmt w:val="bullet"/>
+      <w:lvlText w:val=""/>
+      <w:lvlJc w:val="left"/>
+      <w:pPr>
+        <w:tabs>
+          <w:tab w:val="num" w:pos="1440"/>
+        </w:tabs>
+        <w:ind w:left="1440" w:hanging="360"/>
+      </w:pPr>
+      <w:rPr>
+        <w:rFonts w:ascii="Symbol" w:hAnsi="Symbol" w:hint="default"/>
+        <w:sz w:val="20"/>
+      </w:rPr>
+    </w:lvl>
+    <w:lvl w:ilvl="2" w:tentative="1">
+      <w:start w:val="1"/>
+      <w:numFmt w:val="bullet"/>
+      <w:lvlText w:val=""/>
+      <w:lvlJc w:val="left"/>
+      <w:pPr>
+        <w:tabs>
+          <w:tab w:val="num" w:pos="2160"/>
+        </w:tabs>
+        <w:ind w:left="2160" w:hanging="360"/>
+      </w:pPr>
+      <w:rPr>
+        <w:rFonts w:ascii="Symbol" w:hAnsi="Symbol" w:hint="default"/>
+        <w:sz w:val="20"/>
+      </w:rPr>
+    </w:lvl>
+    <w:lvl w:ilvl="3" w:tentative="1">
+      <w:start w:val="1"/>
+      <w:numFmt w:val="bullet"/>
+      <w:lvlText w:val=""/>
+      <w:lvlJc w:val="left"/>
+      <w:pPr>
+        <w:tabs>
+          <w:tab w:val="num" w:pos="2880"/>
+        </w:tabs>
+        <w:ind w:left="2880" w:hanging="360"/>
+      </w:pPr>
+      <w:rPr>
+        <w:rFonts w:ascii="Symbol" w:hAnsi="Symbol" w:hint="default"/>
+        <w:sz w:val="20"/>
+      </w:rPr>
+    </w:lvl>
+    <w:lvl w:ilvl="4" w:tentative="1">
+      <w:start w:val="1"/>
+      <w:numFmt w:val="bullet"/>
+      <w:lvlText w:val=""/>
+      <w:lvlJc w:val="left"/>
+      <w:pPr>
+        <w:tabs>
+          <w:tab w:val="num" w:pos="3600"/>
+        </w:tabs>
+        <w:ind w:left="3600" w:hanging="360"/>
+      </w:pPr>
+      <w:rPr>
+        <w:rFonts w:ascii="Symbol" w:hAnsi="Symbol" w:hint="default"/>
+        <w:sz w:val="20"/>
+      </w:rPr>
+    </w:lvl>
+    <w:lvl w:ilvl="5" w:tentative="1">
+      <w:start w:val="1"/>
+      <w:numFmt w:val="bullet"/>
+      <w:lvlText w:val=""/>
+      <w:lvlJc w:val="left"/>
+      <w:pPr>
+        <w:tabs>
+          <w:tab w:val="num" w:pos="4320"/>
+        </w:tabs>
+        <w:ind w:left="4320" w:hanging="360"/>
+      </w:pPr>
+      <w:rPr>
+        <w:rFonts w:ascii="Symbol" w:hAnsi="Symbol" w:hint="default"/>
+        <w:sz w:val="20"/>
+      </w:rPr>
+    </w:lvl>
+    <w:lvl w:ilvl="6" w:tentative="1">
+      <w:start w:val="1"/>
+      <w:numFmt w:val="bullet"/>
+      <w:lvlText w:val=""/>
+      <w:lvlJc w:val="left"/>
+      <w:pPr>
+        <w:tabs>
+          <w:tab w:val="num" w:pos="5040"/>
+        </w:tabs>
+        <w:ind w:left="5040" w:hanging="360"/>
+      </w:pPr>
+      <w:rPr>
+        <w:rFonts w:ascii="Symbol" w:hAnsi="Symbol" w:hint="default"/>
+        <w:sz w:val="20"/>
+      </w:rPr>
+    </w:lvl>
+    <w:lvl w:ilvl="7" w:tentative="1">
+      <w:start w:val="1"/>
+      <w:numFmt w:val="bullet"/>
+      <w:lvlText w:val=""/>
+      <w:lvlJc w:val="left"/>
+      <w:pPr>
+        <w:tabs>
+          <w:tab w:val="num" w:pos="5760"/>
+        </w:tabs>
+        <w:ind w:left="5760" w:hanging="360"/>
+      </w:pPr>
+      <w:rPr>
+        <w:rFonts w:ascii="Symbol" w:hAnsi="Symbol" w:hint="default"/>
+        <w:sz w:val="20"/>
+      </w:rPr>
+    </w:lvl>
+    <w:lvl w:ilvl="8" w:tentative="1">
+      <w:start w:val="1"/>
+      <w:numFmt w:val="bullet"/>
+      <w:lvlText w:val=""/>
+      <w:lvlJc w:val="left"/>
+      <w:pPr>
+        <w:tabs>
+          <w:tab w:val="num" w:pos="6480"/>
+        </w:tabs>
+        <w:ind w:left="6480" w:hanging="360"/>
+      </w:pPr>
+      <w:rPr>
+        <w:rFonts w:ascii="Symbol" w:hAnsi="Symbol" w:hint="default"/>
+        <w:sz w:val="20"/>
       </w:rPr>
     </w:lvl>
   </w:abstractNum>
@@ -40613,19 +42502,19 @@
     <w:abstractNumId w:val="7"/>
   </w:num>
   <w:num w:numId="6" w16cid:durableId="389039746">
-    <w:abstractNumId w:val="13"/>
+    <w:abstractNumId w:val="14"/>
   </w:num>
   <w:num w:numId="7" w16cid:durableId="1719165138">
-    <w:abstractNumId w:val="17"/>
+    <w:abstractNumId w:val="20"/>
   </w:num>
   <w:num w:numId="8" w16cid:durableId="313412103">
-    <w:abstractNumId w:val="14"/>
+    <w:abstractNumId w:val="15"/>
   </w:num>
   <w:num w:numId="9" w16cid:durableId="377976967">
-    <w:abstractNumId w:val="23"/>
+    <w:abstractNumId w:val="30"/>
   </w:num>
   <w:num w:numId="10" w16cid:durableId="1225405875">
-    <w:abstractNumId w:val="21"/>
+    <w:abstractNumId w:val="24"/>
   </w:num>
   <w:num w:numId="11" w16cid:durableId="1479959639">
     <w:abstractNumId w:val="1"/>
@@ -40637,7 +42526,7 @@
     <w:abstractNumId w:val="0"/>
   </w:num>
   <w:num w:numId="14" w16cid:durableId="953828373">
-    <w:abstractNumId w:val="12"/>
+    <w:abstractNumId w:val="13"/>
   </w:num>
   <w:num w:numId="15" w16cid:durableId="1087116704">
     <w:abstractNumId w:val="4"/>
@@ -40646,28 +42535,52 @@
     <w:abstractNumId w:val="10"/>
   </w:num>
   <w:num w:numId="17" w16cid:durableId="127628765">
-    <w:abstractNumId w:val="18"/>
+    <w:abstractNumId w:val="21"/>
   </w:num>
   <w:num w:numId="18" w16cid:durableId="1100951693">
-    <w:abstractNumId w:val="20"/>
+    <w:abstractNumId w:val="23"/>
   </w:num>
   <w:num w:numId="19" w16cid:durableId="1266156943">
     <w:abstractNumId w:val="5"/>
   </w:num>
   <w:num w:numId="20" w16cid:durableId="1121072013">
-    <w:abstractNumId w:val="19"/>
+    <w:abstractNumId w:val="22"/>
   </w:num>
   <w:num w:numId="21" w16cid:durableId="187959145">
-    <w:abstractNumId w:val="15"/>
+    <w:abstractNumId w:val="16"/>
   </w:num>
   <w:num w:numId="22" w16cid:durableId="1437599753">
-    <w:abstractNumId w:val="22"/>
+    <w:abstractNumId w:val="26"/>
   </w:num>
   <w:num w:numId="23" w16cid:durableId="1643609410">
     <w:abstractNumId w:val="3"/>
   </w:num>
   <w:num w:numId="24" w16cid:durableId="18438491">
-    <w:abstractNumId w:val="16"/>
+    <w:abstractNumId w:val="17"/>
+  </w:num>
+  <w:num w:numId="25" w16cid:durableId="1035497430">
+    <w:abstractNumId w:val="12"/>
+  </w:num>
+  <w:num w:numId="26" w16cid:durableId="1601834218">
+    <w:abstractNumId w:val="18"/>
+  </w:num>
+  <w:num w:numId="27" w16cid:durableId="313216667">
+    <w:abstractNumId w:val="28"/>
+  </w:num>
+  <w:num w:numId="28" w16cid:durableId="1819835596">
+    <w:abstractNumId w:val="25"/>
+  </w:num>
+  <w:num w:numId="29" w16cid:durableId="1794857632">
+    <w:abstractNumId w:val="27"/>
+  </w:num>
+  <w:num w:numId="30" w16cid:durableId="886793177">
+    <w:abstractNumId w:val="29"/>
+  </w:num>
+  <w:num w:numId="31" w16cid:durableId="714816248">
+    <w:abstractNumId w:val="31"/>
+  </w:num>
+  <w:num w:numId="32" w16cid:durableId="904727200">
+    <w:abstractNumId w:val="19"/>
   </w:num>
   <w:numIdMacAtCleanup w:val="3"/>
 </w:numbering>
@@ -41274,7 +43187,6 @@
   <w:style w:type="character" w:default="1" w:styleId="DefaultParagraphFont">
     <w:name w:val="Default Paragraph Font"/>
     <w:uiPriority w:val="1"/>
-    <w:semiHidden/>
     <w:unhideWhenUsed/>
   </w:style>
   <w:style w:type="table" w:default="1" w:styleId="TableNormal">

</xml_diff>